<commit_message>
AFAC2026: demo pipeline, Streamlit upgrades, and submission pack
Add Remotion demo tooling, expanded Streamlit data features, and refreshed AFAC2026 submission documents and demo assets; ignore local deploy secrets.toml.local.

Co-authored-by: Cursor <cursoragent@cursor.com>
</commit_message>
<xml_diff>
--- a/submission/03_正式文档_WORD/01_AFAC2026_规则对照与评分自评.docx
+++ b/submission/03_正式文档_WORD/01_AFAC2026_规则对照与评分自评.docx
@@ -51,6 +51,32 @@
           <w:rFonts w:ascii="微软雅黑" w:hAnsi="微软雅黑" w:eastAsia="微软雅黑"/>
           <w:color w:val="0A0E27"/>
         </w:rPr>
+        <w:t>零、平台项目标识</w:t>
+      </w:r>
+    </w:p>
+    <w:p>
+      <w:pPr>
+        <w:spacing w:lineRule="auto" w:line="324" w:after="120"/>
+      </w:pPr>
+      <w:r>
+        <w:rPr>
+          <w:rFonts w:ascii="微软雅黑" w:hAnsi="微软雅黑" w:eastAsia="微软雅黑"/>
+          <w:sz w:val="21"/>
+        </w:rPr>
+        <w:t>AFAC 支付宝控制台项目 ID：20260110040</w:t>
+        <w:br/>
+        <w:t>控制台地址：https://afac.alipay.com/console/projects/20260110040</w:t>
+      </w:r>
+    </w:p>
+    <w:p>
+      <w:pPr>
+        <w:pStyle w:val="Heading1"/>
+      </w:pPr>
+      <w:r>
+        <w:rPr>
+          <w:rFonts w:ascii="微软雅黑" w:hAnsi="微软雅黑" w:eastAsia="微软雅黑"/>
+          <w:color w:val="0A0E27"/>
+        </w:rPr>
         <w:t>一、官方要求对照（初创组）</w:t>
       </w:r>
     </w:p>
@@ -70,7 +96,7 @@
       <w:tr>
         <w:tc>
           <w:tcPr>
-            <w:tcW w:type="dxa" w:w="1984"/>
+            <w:tcW w:type="dxa" w:w="1701"/>
             <w:shd w:fill="0A0E27"/>
           </w:tcPr>
           <w:p>
@@ -91,7 +117,7 @@
         </w:tc>
         <w:tc>
           <w:tcPr>
-            <w:tcW w:type="dxa" w:w="2835"/>
+            <w:tcW w:type="dxa" w:w="2551"/>
             <w:shd w:fill="0A0E27"/>
           </w:tcPr>
           <w:p>
@@ -156,7 +182,7 @@
       <w:tr>
         <w:tc>
           <w:tcPr>
-            <w:tcW w:type="dxa" w:w="1984"/>
+            <w:tcW w:type="dxa" w:w="1701"/>
             <w:shd w:fill="E8F4FC"/>
           </w:tcPr>
           <w:p>
@@ -170,13 +196,13 @@
                 <w:b/>
                 <w:sz w:val="19"/>
               </w:rPr>
-              <w:t>在线提交</w:t>
+              <w:t>平台项目</w:t>
             </w:r>
           </w:p>
         </w:tc>
         <w:tc>
           <w:tcPr>
-            <w:tcW w:type="dxa" w:w="2835"/>
+            <w:tcW w:type="dxa" w:w="2551"/>
             <w:shd w:fill="E8F4FC"/>
           </w:tcPr>
           <w:p>
@@ -190,7 +216,7 @@
                 <w:b w:val="0"/>
                 <w:sz w:val="19"/>
               </w:rPr>
-              <w:t>Demo URL + 3分钟视频 + BP</w:t>
+              <w:t>控制台 #20260110040</w:t>
             </w:r>
           </w:p>
         </w:tc>
@@ -210,167 +236,7 @@
                 <w:b w:val="0"/>
                 <w:sz w:val="19"/>
               </w:rPr>
-              <w:t>https://3blue1brownlab.cn + MP4 + Word/PDF</w:t>
-            </w:r>
-          </w:p>
-        </w:tc>
-        <w:tc>
-          <w:tcPr>
-            <w:tcW w:type="dxa" w:w="1417"/>
-            <w:shd w:fill="E8F4FC"/>
-          </w:tcPr>
-          <w:p>
-            <w:pPr>
-              <w:jc w:val="left"/>
-            </w:pPr>
-            <w:r/>
-            <w:r>
-              <w:rPr>
-                <w:rFonts w:ascii="微软雅黑" w:hAnsi="微软雅黑" w:eastAsia="微软雅黑"/>
-                <w:b w:val="0"/>
-                <w:sz w:val="19"/>
-              </w:rPr>
-              <w:t>Demo✅ 视频⚠</w:t>
-            </w:r>
-          </w:p>
-        </w:tc>
-      </w:tr>
-      <w:tr>
-        <w:tc>
-          <w:tcPr>
-            <w:tcW w:type="dxa" w:w="1984"/>
-          </w:tcPr>
-          <w:p>
-            <w:pPr>
-              <w:jc w:val="left"/>
-            </w:pPr>
-            <w:r/>
-            <w:r>
-              <w:rPr>
-                <w:rFonts w:ascii="微软雅黑" w:hAnsi="微软雅黑" w:eastAsia="微软雅黑"/>
-                <w:b/>
-                <w:sz w:val="19"/>
-              </w:rPr>
-              <w:t>代码仓库</w:t>
-            </w:r>
-          </w:p>
-        </w:tc>
-        <w:tc>
-          <w:tcPr>
-            <w:tcW w:type="dxa" w:w="2835"/>
-          </w:tcPr>
-          <w:p>
-            <w:pPr>
-              <w:jc w:val="left"/>
-            </w:pPr>
-            <w:r/>
-            <w:r>
-              <w:rPr>
-                <w:rFonts w:ascii="微软雅黑" w:hAnsi="微软雅黑" w:eastAsia="微软雅黑"/>
-                <w:b w:val="0"/>
-                <w:sz w:val="19"/>
-              </w:rPr>
-              <w:t>GitHub/Gitee + README</w:t>
-            </w:r>
-          </w:p>
-        </w:tc>
-        <w:tc>
-          <w:tcPr>
-            <w:tcW w:type="dxa" w:w="3118"/>
-          </w:tcPr>
-          <w:p>
-            <w:pPr>
-              <w:jc w:val="left"/>
-            </w:pPr>
-            <w:r/>
-            <w:r>
-              <w:rPr>
-                <w:rFonts w:ascii="微软雅黑" w:hAnsi="微软雅黑" w:eastAsia="微软雅黑"/>
-                <w:b w:val="0"/>
-                <w:sz w:val="19"/>
-              </w:rPr>
-              <w:t>github.com/yigenfeng0707-netizen/quantinsight-pro</w:t>
-            </w:r>
-          </w:p>
-        </w:tc>
-        <w:tc>
-          <w:tcPr>
-            <w:tcW w:type="dxa" w:w="1417"/>
-          </w:tcPr>
-          <w:p>
-            <w:pPr>
-              <w:jc w:val="left"/>
-            </w:pPr>
-            <w:r/>
-            <w:r>
-              <w:rPr>
-                <w:rFonts w:ascii="微软雅黑" w:hAnsi="微软雅黑" w:eastAsia="微软雅黑"/>
-                <w:b w:val="0"/>
-                <w:sz w:val="19"/>
-              </w:rPr>
-              <w:t>✅</w:t>
-            </w:r>
-          </w:p>
-        </w:tc>
-      </w:tr>
-      <w:tr>
-        <w:tc>
-          <w:tcPr>
-            <w:tcW w:type="dxa" w:w="1984"/>
-            <w:shd w:fill="E8F4FC"/>
-          </w:tcPr>
-          <w:p>
-            <w:pPr>
-              <w:jc w:val="left"/>
-            </w:pPr>
-            <w:r/>
-            <w:r>
-              <w:rPr>
-                <w:rFonts w:ascii="微软雅黑" w:hAnsi="微软雅黑" w:eastAsia="微软雅黑"/>
-                <w:b/>
-                <w:sz w:val="19"/>
-              </w:rPr>
-              <w:t>商业计划书</w:t>
-            </w:r>
-          </w:p>
-        </w:tc>
-        <w:tc>
-          <w:tcPr>
-            <w:tcW w:type="dxa" w:w="2835"/>
-            <w:shd w:fill="E8F4FC"/>
-          </w:tcPr>
-          <w:p>
-            <w:pPr>
-              <w:jc w:val="left"/>
-            </w:pPr>
-            <w:r/>
-            <w:r>
-              <w:rPr>
-                <w:rFonts w:ascii="微软雅黑" w:hAnsi="微软雅黑" w:eastAsia="微软雅黑"/>
-                <w:b w:val="0"/>
-                <w:sz w:val="19"/>
-              </w:rPr>
-              <w:t>PDF/DOCX，八章节</w:t>
-            </w:r>
-          </w:p>
-        </w:tc>
-        <w:tc>
-          <w:tcPr>
-            <w:tcW w:type="dxa" w:w="3118"/>
-            <w:shd w:fill="E8F4FC"/>
-          </w:tcPr>
-          <w:p>
-            <w:pPr>
-              <w:jc w:val="left"/>
-            </w:pPr>
-            <w:r/>
-            <w:r>
-              <w:rPr>
-                <w:rFonts w:ascii="微软雅黑" w:hAnsi="微软雅黑" w:eastAsia="微软雅黑"/>
-                <w:b w:val="0"/>
-                <w:sz w:val="19"/>
-              </w:rPr>
-              <w:t>submission/03_正式文档_WORD/</w:t>
+              <w:t>https://afac.alipay.com/console/projects/20260110040</w:t>
             </w:r>
           </w:p>
         </w:tc>
@@ -398,7 +264,7 @@
       <w:tr>
         <w:tc>
           <w:tcPr>
-            <w:tcW w:type="dxa" w:w="1984"/>
+            <w:tcW w:type="dxa" w:w="1701"/>
           </w:tcPr>
           <w:p>
             <w:pPr>
@@ -411,13 +277,13 @@
                 <w:b/>
                 <w:sz w:val="19"/>
               </w:rPr>
-              <w:t>产品原型</w:t>
+              <w:t>在线提交</w:t>
             </w:r>
           </w:p>
         </w:tc>
         <w:tc>
           <w:tcPr>
-            <w:tcW w:type="dxa" w:w="2835"/>
+            <w:tcW w:type="dxa" w:w="2551"/>
           </w:tcPr>
           <w:p>
             <w:pPr>
@@ -430,7 +296,7 @@
                 <w:b w:val="0"/>
                 <w:sz w:val="19"/>
               </w:rPr>
-              <w:t>可运行 Demo</w:t>
+              <w:t>Demo URL + 3分钟视频 + BP</w:t>
             </w:r>
           </w:p>
         </w:tc>
@@ -449,7 +315,7 @@
                 <w:b w:val="0"/>
                 <w:sz w:val="19"/>
               </w:rPr>
-              <w:t>Streamlit + ECS 生产部署</w:t>
+              <w:t>https://3blue1brownlab.cn + MP4 + Word</w:t>
             </w:r>
           </w:p>
         </w:tc>
@@ -468,7 +334,7 @@
                 <w:b w:val="0"/>
                 <w:sz w:val="19"/>
               </w:rPr>
-              <w:t>✅</w:t>
+              <w:t>Demo✅ 视频⚠</w:t>
             </w:r>
           </w:p>
         </w:tc>
@@ -476,7 +342,7 @@
       <w:tr>
         <w:tc>
           <w:tcPr>
-            <w:tcW w:type="dxa" w:w="1984"/>
+            <w:tcW w:type="dxa" w:w="1701"/>
             <w:shd w:fill="E8F4FC"/>
           </w:tcPr>
           <w:p>
@@ -490,13 +356,13 @@
                 <w:b/>
                 <w:sz w:val="19"/>
               </w:rPr>
-              <w:t>团队信息</w:t>
+              <w:t>代码仓库</w:t>
             </w:r>
           </w:p>
         </w:tc>
         <w:tc>
           <w:tcPr>
-            <w:tcW w:type="dxa" w:w="2835"/>
+            <w:tcW w:type="dxa" w:w="2551"/>
             <w:shd w:fill="E8F4FC"/>
           </w:tcPr>
           <w:p>
@@ -510,7 +376,7 @@
                 <w:b w:val="0"/>
                 <w:sz w:val="19"/>
               </w:rPr>
-              <w:t>AFAC 平台注册真名</w:t>
+              <w:t>GitHub/Gitee + README</w:t>
             </w:r>
           </w:p>
         </w:tc>
@@ -530,7 +396,7 @@
                 <w:b w:val="0"/>
                 <w:sz w:val="19"/>
               </w:rPr>
-              <w:t>冯亦根/王宇寒/官馨/梁理智</w:t>
+              <w:t>github.com/yigenfeng0707-netizen/quantinsight-pro</w:t>
             </w:r>
           </w:p>
         </w:tc>
@@ -558,7 +424,327 @@
       <w:tr>
         <w:tc>
           <w:tcPr>
-            <w:tcW w:type="dxa" w:w="1984"/>
+            <w:tcW w:type="dxa" w:w="1701"/>
+          </w:tcPr>
+          <w:p>
+            <w:pPr>
+              <w:jc w:val="left"/>
+            </w:pPr>
+            <w:r/>
+            <w:r>
+              <w:rPr>
+                <w:rFonts w:ascii="微软雅黑" w:hAnsi="微软雅黑" w:eastAsia="微软雅黑"/>
+                <w:b/>
+                <w:sz w:val="19"/>
+              </w:rPr>
+              <w:t>商业计划书</w:t>
+            </w:r>
+          </w:p>
+        </w:tc>
+        <w:tc>
+          <w:tcPr>
+            <w:tcW w:type="dxa" w:w="2551"/>
+          </w:tcPr>
+          <w:p>
+            <w:pPr>
+              <w:jc w:val="left"/>
+            </w:pPr>
+            <w:r/>
+            <w:r>
+              <w:rPr>
+                <w:rFonts w:ascii="微软雅黑" w:hAnsi="微软雅黑" w:eastAsia="微软雅黑"/>
+                <w:b w:val="0"/>
+                <w:sz w:val="19"/>
+              </w:rPr>
+              <w:t>PDF/DOCX，八章节</w:t>
+            </w:r>
+          </w:p>
+        </w:tc>
+        <w:tc>
+          <w:tcPr>
+            <w:tcW w:type="dxa" w:w="3118"/>
+          </w:tcPr>
+          <w:p>
+            <w:pPr>
+              <w:jc w:val="left"/>
+            </w:pPr>
+            <w:r/>
+            <w:r>
+              <w:rPr>
+                <w:rFonts w:ascii="微软雅黑" w:hAnsi="微软雅黑" w:eastAsia="微软雅黑"/>
+                <w:b w:val="0"/>
+                <w:sz w:val="19"/>
+              </w:rPr>
+              <w:t>07_商业计划书.docx</w:t>
+            </w:r>
+          </w:p>
+        </w:tc>
+        <w:tc>
+          <w:tcPr>
+            <w:tcW w:type="dxa" w:w="1417"/>
+          </w:tcPr>
+          <w:p>
+            <w:pPr>
+              <w:jc w:val="left"/>
+            </w:pPr>
+            <w:r/>
+            <w:r>
+              <w:rPr>
+                <w:rFonts w:ascii="微软雅黑" w:hAnsi="微软雅黑" w:eastAsia="微软雅黑"/>
+                <w:b w:val="0"/>
+                <w:sz w:val="19"/>
+              </w:rPr>
+              <w:t>✅</w:t>
+            </w:r>
+          </w:p>
+        </w:tc>
+      </w:tr>
+      <w:tr>
+        <w:tc>
+          <w:tcPr>
+            <w:tcW w:type="dxa" w:w="1701"/>
+            <w:shd w:fill="E8F4FC"/>
+          </w:tcPr>
+          <w:p>
+            <w:pPr>
+              <w:jc w:val="left"/>
+            </w:pPr>
+            <w:r/>
+            <w:r>
+              <w:rPr>
+                <w:rFonts w:ascii="微软雅黑" w:hAnsi="微软雅黑" w:eastAsia="微软雅黑"/>
+                <w:b/>
+                <w:sz w:val="19"/>
+              </w:rPr>
+              <w:t>产品原型</w:t>
+            </w:r>
+          </w:p>
+        </w:tc>
+        <w:tc>
+          <w:tcPr>
+            <w:tcW w:type="dxa" w:w="2551"/>
+            <w:shd w:fill="E8F4FC"/>
+          </w:tcPr>
+          <w:p>
+            <w:pPr>
+              <w:jc w:val="left"/>
+            </w:pPr>
+            <w:r/>
+            <w:r>
+              <w:rPr>
+                <w:rFonts w:ascii="微软雅黑" w:hAnsi="微软雅黑" w:eastAsia="微软雅黑"/>
+                <w:b w:val="0"/>
+                <w:sz w:val="19"/>
+              </w:rPr>
+              <w:t>可运行 Demo</w:t>
+            </w:r>
+          </w:p>
+        </w:tc>
+        <w:tc>
+          <w:tcPr>
+            <w:tcW w:type="dxa" w:w="3118"/>
+            <w:shd w:fill="E8F4FC"/>
+          </w:tcPr>
+          <w:p>
+            <w:pPr>
+              <w:jc w:val="left"/>
+            </w:pPr>
+            <w:r/>
+            <w:r>
+              <w:rPr>
+                <w:rFonts w:ascii="微软雅黑" w:hAnsi="微软雅黑" w:eastAsia="微软雅黑"/>
+                <w:b w:val="0"/>
+                <w:sz w:val="19"/>
+              </w:rPr>
+              <w:t>Streamlit + ECS 生产部署</w:t>
+            </w:r>
+          </w:p>
+        </w:tc>
+        <w:tc>
+          <w:tcPr>
+            <w:tcW w:type="dxa" w:w="1417"/>
+            <w:shd w:fill="E8F4FC"/>
+          </w:tcPr>
+          <w:p>
+            <w:pPr>
+              <w:jc w:val="left"/>
+            </w:pPr>
+            <w:r/>
+            <w:r>
+              <w:rPr>
+                <w:rFonts w:ascii="微软雅黑" w:hAnsi="微软雅黑" w:eastAsia="微软雅黑"/>
+                <w:b w:val="0"/>
+                <w:sz w:val="19"/>
+              </w:rPr>
+              <w:t>✅</w:t>
+            </w:r>
+          </w:p>
+        </w:tc>
+      </w:tr>
+      <w:tr>
+        <w:tc>
+          <w:tcPr>
+            <w:tcW w:type="dxa" w:w="1701"/>
+          </w:tcPr>
+          <w:p>
+            <w:pPr>
+              <w:jc w:val="left"/>
+            </w:pPr>
+            <w:r/>
+            <w:r>
+              <w:rPr>
+                <w:rFonts w:ascii="微软雅黑" w:hAnsi="微软雅黑" w:eastAsia="微软雅黑"/>
+                <w:b/>
+                <w:sz w:val="19"/>
+              </w:rPr>
+              <w:t>团队信息</w:t>
+            </w:r>
+          </w:p>
+        </w:tc>
+        <w:tc>
+          <w:tcPr>
+            <w:tcW w:type="dxa" w:w="2551"/>
+          </w:tcPr>
+          <w:p>
+            <w:pPr>
+              <w:jc w:val="left"/>
+            </w:pPr>
+            <w:r/>
+            <w:r>
+              <w:rPr>
+                <w:rFonts w:ascii="微软雅黑" w:hAnsi="微软雅黑" w:eastAsia="微软雅黑"/>
+                <w:b w:val="0"/>
+                <w:sz w:val="19"/>
+              </w:rPr>
+              <w:t>AFAC 平台注册真名</w:t>
+            </w:r>
+          </w:p>
+        </w:tc>
+        <w:tc>
+          <w:tcPr>
+            <w:tcW w:type="dxa" w:w="3118"/>
+          </w:tcPr>
+          <w:p>
+            <w:pPr>
+              <w:jc w:val="left"/>
+            </w:pPr>
+            <w:r/>
+            <w:r>
+              <w:rPr>
+                <w:rFonts w:ascii="微软雅黑" w:hAnsi="微软雅黑" w:eastAsia="微软雅黑"/>
+                <w:b w:val="0"/>
+                <w:sz w:val="19"/>
+              </w:rPr>
+              <w:t>冯亦根/王宇寒/官馨/梁理智</w:t>
+            </w:r>
+          </w:p>
+        </w:tc>
+        <w:tc>
+          <w:tcPr>
+            <w:tcW w:type="dxa" w:w="1417"/>
+          </w:tcPr>
+          <w:p>
+            <w:pPr>
+              <w:jc w:val="left"/>
+            </w:pPr>
+            <w:r/>
+            <w:r>
+              <w:rPr>
+                <w:rFonts w:ascii="微软雅黑" w:hAnsi="微软雅黑" w:eastAsia="微软雅黑"/>
+                <w:b w:val="0"/>
+                <w:sz w:val="19"/>
+              </w:rPr>
+              <w:t>✅</w:t>
+            </w:r>
+          </w:p>
+        </w:tc>
+      </w:tr>
+      <w:tr>
+        <w:tc>
+          <w:tcPr>
+            <w:tcW w:type="dxa" w:w="1701"/>
+            <w:shd w:fill="E8F4FC"/>
+          </w:tcPr>
+          <w:p>
+            <w:pPr>
+              <w:jc w:val="left"/>
+            </w:pPr>
+            <w:r/>
+            <w:r>
+              <w:rPr>
+                <w:rFonts w:ascii="微软雅黑" w:hAnsi="微软雅黑" w:eastAsia="微软雅黑"/>
+                <w:b/>
+                <w:sz w:val="19"/>
+              </w:rPr>
+              <w:t>工商材料</w:t>
+            </w:r>
+          </w:p>
+        </w:tc>
+        <w:tc>
+          <w:tcPr>
+            <w:tcW w:type="dxa" w:w="2551"/>
+            <w:shd w:fill="E8F4FC"/>
+          </w:tcPr>
+          <w:p>
+            <w:pPr>
+              <w:jc w:val="left"/>
+            </w:pPr>
+            <w:r/>
+            <w:r>
+              <w:rPr>
+                <w:rFonts w:ascii="微软雅黑" w:hAnsi="微软雅黑" w:eastAsia="微软雅黑"/>
+                <w:b w:val="0"/>
+                <w:sz w:val="19"/>
+              </w:rPr>
+              <w:t>营业执照+信用代码（如已注册）</w:t>
+            </w:r>
+          </w:p>
+        </w:tc>
+        <w:tc>
+          <w:tcPr>
+            <w:tcW w:type="dxa" w:w="3118"/>
+            <w:shd w:fill="E8F4FC"/>
+          </w:tcPr>
+          <w:p>
+            <w:pPr>
+              <w:jc w:val="left"/>
+            </w:pPr>
+            <w:r/>
+            <w:r>
+              <w:rPr>
+                <w:rFonts w:ascii="微软雅黑" w:hAnsi="微软雅黑" w:eastAsia="微软雅黑"/>
+                <w:b w:val="0"/>
+                <w:sz w:val="19"/>
+              </w:rPr>
+              <w:t>线下扫描上传</w:t>
+            </w:r>
+          </w:p>
+        </w:tc>
+        <w:tc>
+          <w:tcPr>
+            <w:tcW w:type="dxa" w:w="1417"/>
+            <w:shd w:fill="E8F4FC"/>
+          </w:tcPr>
+          <w:p>
+            <w:pPr>
+              <w:jc w:val="left"/>
+            </w:pPr>
+            <w:r/>
+            <w:r>
+              <w:rPr>
+                <w:rFonts w:ascii="微软雅黑" w:hAnsi="微软雅黑" w:eastAsia="微软雅黑"/>
+                <w:b w:val="0"/>
+                <w:sz w:val="19"/>
+              </w:rPr>
+              <w:t>⚠ 人工</w:t>
+            </w:r>
+          </w:p>
+        </w:tc>
+      </w:tr>
+      <w:tr>
+        <w:tc>
+          <w:tcPr>
+            <w:tcW w:type="dxa" w:w="1701"/>
           </w:tcPr>
           <w:p>
             <w:pPr>
@@ -577,7 +763,7 @@
         </w:tc>
         <w:tc>
           <w:tcPr>
-            <w:tcW w:type="dxa" w:w="2835"/>
+            <w:tcW w:type="dxa" w:w="2551"/>
           </w:tcPr>
           <w:p>
             <w:pPr>
@@ -590,7 +776,7 @@
                 <w:b w:val="0"/>
                 <w:sz w:val="19"/>
               </w:rPr>
-              <w:t>承诺书+身份证（线下）</w:t>
+              <w:t>承诺书+身份证</w:t>
             </w:r>
           </w:p>
         </w:tc>
@@ -609,7 +795,7 @@
                 <w:b w:val="0"/>
                 <w:sz w:val="19"/>
               </w:rPr>
-              <w:t>需人工签字扫描</w:t>
+              <w:t>打印签字扫描</w:t>
             </w:r>
           </w:p>
         </w:tc>
@@ -647,6 +833,59 @@
         <w:t>二、AFAC 初筛五维评分自评（100分制）</w:t>
       </w:r>
     </w:p>
+    <w:p>
+      <w:pPr>
+        <w:jc w:val="center"/>
+      </w:pPr>
+      <w:r>
+        <w:drawing>
+          <wp:inline xmlns:a="http://schemas.openxmlformats.org/drawingml/2006/main" xmlns:pic="http://schemas.openxmlformats.org/drawingml/2006/picture">
+            <wp:extent cx="3960000" cy="3579429"/>
+            <wp:docPr id="1" name="Picture 1"/>
+            <wp:cNvGraphicFramePr>
+              <a:graphicFrameLocks noChangeAspect="1"/>
+            </wp:cNvGraphicFramePr>
+            <a:graphic>
+              <a:graphicData uri="http://schemas.openxmlformats.org/drawingml/2006/picture">
+                <pic:pic>
+                  <pic:nvPicPr>
+                    <pic:cNvPr id="0" name="chart_afac_scoring.png"/>
+                    <pic:cNvPicPr/>
+                  </pic:nvPicPr>
+                  <pic:blipFill>
+                    <a:blip r:embed="rId9"/>
+                    <a:stretch>
+                      <a:fillRect/>
+                    </a:stretch>
+                  </pic:blipFill>
+                  <pic:spPr>
+                    <a:xfrm>
+                      <a:off x="0" y="0"/>
+                      <a:ext cx="3960000" cy="3579429"/>
+                    </a:xfrm>
+                    <a:prstGeom prst="rect"/>
+                  </pic:spPr>
+                </pic:pic>
+              </a:graphicData>
+            </a:graphic>
+          </wp:inline>
+        </w:drawing>
+      </w:r>
+    </w:p>
+    <w:p>
+      <w:pPr>
+        <w:jc w:val="center"/>
+      </w:pPr>
+      <w:r>
+        <w:rPr>
+          <w:rFonts w:ascii="微软雅黑" w:hAnsi="微软雅黑" w:eastAsia="微软雅黑"/>
+          <w:color w:val="666666"/>
+          <w:sz w:val="18"/>
+        </w:rPr>
+        <w:t>图1 五维评分雷达图</w:t>
+      </w:r>
+    </w:p>
+    <w:p/>
     <w:tbl>
       <w:tblPr>
         <w:tblStyle w:val="TableGrid"/>
@@ -1376,7 +1615,7 @@
           <w:rFonts w:ascii="微软雅黑" w:hAnsi="微软雅黑" w:eastAsia="微软雅黑"/>
           <w:color w:val="0A0E27"/>
         </w:rPr>
-        <w:t>三、与创·在上海五维评分对照</w:t>
+        <w:t>三、评分维度说明</w:t>
       </w:r>
     </w:p>
     <w:p>
@@ -1388,7 +1627,7 @@
           <w:rFonts w:ascii="微软雅黑" w:hAnsi="微软雅黑" w:eastAsia="微软雅黑"/>
           <w:sz w:val="21"/>
         </w:rPr>
-        <w:t>创·在上海团队组采用市场30%+创新25%+团队20%+实施15%+答辩10%权重。QuantInsight 自评85.5分，与AFAC自评88分口径不同，提交时以 AFAC 平台字段为准。</w:t>
+        <w:t>AFAC 初创组初筛采用项目创新性、技术成熟度、商业模式与落地、团队综合素质、社会效益五维加权。本自评 88 分，核心证据：SHAP 可解释选股、公网 Demo 稳定、永字资管战略合作、T35 回测验证。</w:t>
       </w:r>
     </w:p>
     <w:p>

</xml_diff>